<commit_message>
Pulir la planilla de preinscripcion: lineas de financiamiento, logo realineado, menciones en mayusculas y titulo partido
</commit_message>
<xml_diff>
--- a/storage/app/private/preinscripcion/plantilla.docx
+++ b/storage/app/private/preinscripcion/plantilla.docx
@@ -32,7 +32,7 @@
             <v:path o:extrusionok="f" gradientshapeok="t" o:connecttype="rect"/>
             <o:lock v:ext="edit" aspectratio="t"/>
           </v:shapetype>
-          <v:shape id="_x0000_s1149" type="#_x0000_t75" style="position:absolute;left:0;text-align:left;margin-left:226pt;margin-top:-14.45pt;width:53.25pt;height:51.35pt;z-index:-1">
+          <v:shape id="_x0000_s1149" type="#_x0000_t75" style="position:absolute;left:0;text-align:left;margin-left:261pt;margin-top:-14.45pt;width:53.25pt;height:51.35pt;z-index:-1">
             <v:imagedata r:id="rId6" o:title="LOGO UDO2"/>
           </v:shape>
         </w:pict>
@@ -122,6 +122,9 @@
         <w:ind w:left="1400"/>
         <w:jc w:val="center"/>
       </w:pPr>
+      <w:r>
+        <w:t xml:space="preserve">${menciones_extra}</w:t>
+      </w:r>
       <w:r>
         <w:t xml:space="preserve"> AÑO </w:t>
       </w:r>
@@ -1928,7 +1931,15 @@
                       <w:sz w:val="20"/>
                       <w:szCs w:val="20"/>
                     </w:rPr>
-                    <w:t>${financiamiento_propia}</w:t>
+                    <w:t xml:space="preserve"> </w:t>
+                  </w:r>
+                  <w:r>
+                    <w:rPr>
+                      <w:sz w:val="20"/>
+                      <w:szCs w:val="20"/>
+                      <w:u w:val="single"/>
+                    </w:rPr>
+                    <w:t xml:space="preserve">      ${financiamiento_propia}      </w:t>
                   </w:r>
                   <w:r>
                     <w:rPr>
@@ -1949,7 +1960,15 @@
                       <w:sz w:val="20"/>
                       <w:szCs w:val="20"/>
                     </w:rPr>
-                    <w:t>${financiamiento_publico}</w:t>
+                    <w:t xml:space="preserve"> </w:t>
+                  </w:r>
+                  <w:r>
+                    <w:rPr>
+                      <w:sz w:val="20"/>
+                      <w:szCs w:val="20"/>
+                      <w:u w:val="single"/>
+                    </w:rPr>
+                    <w:t xml:space="preserve">      ${financiamiento_publico}      </w:t>
                   </w:r>
                   <w:r>
                     <w:rPr>
@@ -1970,7 +1989,15 @@
                       <w:sz w:val="20"/>
                       <w:szCs w:val="20"/>
                     </w:rPr>
-                    <w:t>${financiamiento_otra}</w:t>
+                    <w:t xml:space="preserve"> </w:t>
+                  </w:r>
+                  <w:r>
+                    <w:rPr>
+                      <w:sz w:val="20"/>
+                      <w:szCs w:val="20"/>
+                      <w:u w:val="single"/>
+                    </w:rPr>
+                    <w:t xml:space="preserve">      ${financiamiento_otra}      </w:t>
                   </w:r>
                   <w:r>
                     <w:rPr>

</xml_diff>

<commit_message>
Ajustar la maquetacion de la planilla de preinscripcion (tabla B, firma, bloque D con pestana derecha y salto de IMPORTANTE)
</commit_message>
<xml_diff>
--- a/storage/app/private/preinscripcion/plantilla.docx
+++ b/storage/app/private/preinscripcion/plantilla.docx
@@ -2318,7 +2318,7 @@
           <w:p>
             <w:pPr>
               <w:snapToGrid w:val="0"/>
-              <w:spacing w:line="360" w:lineRule="auto"/>
+              <w:spacing w:line="240" w:lineRule="auto"/>
               <w:jc w:val="center"/>
               <w:rPr>
                 <w:b/>
@@ -2333,7 +2333,7 @@
                 <w:szCs w:val="22"/>
               </w:rPr>
               <w:lastRenderedPageBreak/>
-              <w:t xml:space="preserve"> GRADOS</w:t>
+              <w:t xml:space="preserve">GRADOS</w:t>
             </w:r>
           </w:p>
         </w:tc>
@@ -2351,7 +2351,7 @@
           <w:p>
             <w:pPr>
               <w:snapToGrid w:val="0"/>
-              <w:spacing w:line="360" w:lineRule="auto"/>
+              <w:spacing w:line="240" w:lineRule="auto"/>
               <w:jc w:val="center"/>
               <w:rPr>
                 <w:b/>
@@ -2365,7 +2365,7 @@
                 <w:sz w:val="22"/>
                 <w:szCs w:val="22"/>
               </w:rPr>
-              <w:t xml:space="preserve"> INSTITUCIÓN</w:t>
+              <w:t xml:space="preserve">INSTITUCIÓN</w:t>
             </w:r>
           </w:p>
         </w:tc>
@@ -2383,7 +2383,7 @@
           <w:p>
             <w:pPr>
               <w:snapToGrid w:val="0"/>
-              <w:spacing w:line="360" w:lineRule="auto"/>
+              <w:spacing w:line="240" w:lineRule="auto"/>
               <w:jc w:val="center"/>
               <w:rPr>
                 <w:b/>
@@ -2415,7 +2415,7 @@
           <w:p>
             <w:pPr>
               <w:snapToGrid w:val="0"/>
-              <w:spacing w:line="360" w:lineRule="auto"/>
+              <w:spacing w:line="240" w:lineRule="auto"/>
               <w:jc w:val="center"/>
               <w:rPr>
                 <w:b/>
@@ -2447,7 +2447,7 @@
           <w:p>
             <w:pPr>
               <w:snapToGrid w:val="0"/>
-              <w:spacing w:line="360" w:lineRule="auto"/>
+              <w:spacing w:line="240" w:lineRule="auto"/>
               <w:jc w:val="center"/>
               <w:rPr>
                 <w:b/>
@@ -2480,7 +2480,7 @@
           <w:p>
             <w:pPr>
               <w:snapToGrid w:val="0"/>
-              <w:spacing w:line="360" w:lineRule="auto"/>
+              <w:spacing w:line="240" w:lineRule="auto"/>
               <w:jc w:val="center"/>
               <w:rPr>
                 <w:b/>
@@ -2516,7 +2516,7 @@
           <w:p>
             <w:pPr>
               <w:snapToGrid w:val="0"/>
-              <w:spacing w:line="360" w:lineRule="auto"/>
+              <w:spacing w:line="240" w:lineRule="auto"/>
               <w:jc w:val="center"/>
               <w:rPr>
                 <w:sz w:val="22"/>
@@ -2528,7 +2528,7 @@
                 <w:sz w:val="22"/>
                 <w:szCs w:val="22"/>
               </w:rPr>
-              <w:t xml:space="preserve">UNIVERSITARIOS </w:t>
+              <w:t xml:space="preserve">UNIVERSITARIOS</w:t>
             </w:r>
           </w:p>
         </w:tc>
@@ -2545,14 +2545,18 @@
           <w:p>
             <w:pPr>
               <w:snapToGrid w:val="0"/>
-              <w:spacing w:line="276" w:lineRule="auto"/>
+              <w:spacing w:line="240" w:lineRule="auto"/>
               <w:rPr>
                 <w:b/>
+                <w:sz w:val="20"/>
+                <w:szCs w:val="20"/>
               </w:rPr>
             </w:pPr>
             <w:r>
               <w:rPr>
                 <w:b/>
+                <w:sz w:val="20"/>
+                <w:szCs w:val="20"/>
               </w:rPr>
               <w:t xml:space="preserve">${grado_universitario_institucion}</w:t>
             </w:r>
@@ -2571,20 +2575,18 @@
           <w:p>
             <w:pPr>
               <w:snapToGrid w:val="0"/>
-              <w:spacing w:line="360" w:lineRule="auto"/>
+              <w:spacing w:line="240" w:lineRule="auto"/>
               <w:rPr>
                 <w:b/>
+                <w:sz w:val="20"/>
+                <w:szCs w:val="20"/>
               </w:rPr>
             </w:pPr>
             <w:r>
               <w:rPr>
                 <w:b/>
-              </w:rPr>
-              <w:t xml:space="preserve"> </w:t>
-            </w:r>
-            <w:r>
-              <w:rPr>
-                <w:b/>
+                <w:sz w:val="20"/>
+                <w:szCs w:val="20"/>
               </w:rPr>
               <w:t xml:space="preserve">${grado_universitario_titulo}</w:t>
             </w:r>
@@ -2603,20 +2605,18 @@
           <w:p>
             <w:pPr>
               <w:snapToGrid w:val="0"/>
-              <w:spacing w:line="360" w:lineRule="auto"/>
+              <w:spacing w:line="240" w:lineRule="auto"/>
               <w:rPr>
                 <w:b/>
+                <w:sz w:val="20"/>
+                <w:szCs w:val="20"/>
               </w:rPr>
             </w:pPr>
             <w:r>
               <w:rPr>
                 <w:b/>
-              </w:rPr>
-              <w:t xml:space="preserve"> </w:t>
-            </w:r>
-            <w:r>
-              <w:rPr>
-                <w:b/>
+                <w:sz w:val="20"/>
+                <w:szCs w:val="20"/>
               </w:rPr>
               <w:t xml:space="preserve">${grado_universitario_anos}</w:t>
             </w:r>
@@ -2635,20 +2635,18 @@
           <w:p>
             <w:pPr>
               <w:snapToGrid w:val="0"/>
-              <w:spacing w:line="360" w:lineRule="auto"/>
+              <w:spacing w:line="240" w:lineRule="auto"/>
               <w:rPr>
                 <w:b/>
+                <w:sz w:val="20"/>
+                <w:szCs w:val="20"/>
               </w:rPr>
             </w:pPr>
             <w:r>
               <w:rPr>
                 <w:b/>
-              </w:rPr>
-              <w:t xml:space="preserve"> </w:t>
-            </w:r>
-            <w:r>
-              <w:rPr>
-                <w:b/>
+                <w:sz w:val="20"/>
+                <w:szCs w:val="20"/>
               </w:rPr>
               <w:t>${grado_universitario_pais}</w:t>
             </w:r>
@@ -2668,20 +2666,18 @@
           <w:p>
             <w:pPr>
               <w:snapToGrid w:val="0"/>
-              <w:spacing w:line="360" w:lineRule="auto"/>
+              <w:spacing w:line="240" w:lineRule="auto"/>
               <w:rPr>
                 <w:b/>
+                <w:sz w:val="20"/>
+                <w:szCs w:val="20"/>
               </w:rPr>
             </w:pPr>
             <w:r>
               <w:rPr>
                 <w:b/>
-              </w:rPr>
-              <w:t xml:space="preserve"> </w:t>
-            </w:r>
-            <w:r>
-              <w:rPr>
-                <w:b/>
+                <w:sz w:val="20"/>
+                <w:szCs w:val="20"/>
               </w:rPr>
               <w:t>${grado_universitario_fecha}</w:t>
             </w:r>
@@ -2705,7 +2701,7 @@
           <w:p>
             <w:pPr>
               <w:snapToGrid w:val="0"/>
-              <w:spacing w:line="360" w:lineRule="auto"/>
+              <w:spacing w:line="240" w:lineRule="auto"/>
               <w:jc w:val="center"/>
               <w:rPr>
                 <w:sz w:val="22"/>
@@ -2717,7 +2713,7 @@
                 <w:sz w:val="22"/>
                 <w:szCs w:val="22"/>
               </w:rPr>
-              <w:t xml:space="preserve"> UNIVERSITARIOS</w:t>
+              <w:t xml:space="preserve">UNIVERSITARIOS</w:t>
             </w:r>
           </w:p>
         </w:tc>
@@ -2734,9 +2730,11 @@
           <w:p>
             <w:pPr>
               <w:snapToGrid w:val="0"/>
-              <w:spacing w:line="360" w:lineRule="auto"/>
+              <w:spacing w:line="240" w:lineRule="auto"/>
               <w:rPr>
                 <w:b/>
+                <w:sz w:val="20"/>
+                <w:szCs w:val="20"/>
               </w:rPr>
             </w:pPr>
           </w:p>
@@ -2754,9 +2752,11 @@
           <w:p>
             <w:pPr>
               <w:snapToGrid w:val="0"/>
-              <w:spacing w:line="360" w:lineRule="auto"/>
+              <w:spacing w:line="240" w:lineRule="auto"/>
               <w:rPr>
                 <w:b/>
+                <w:sz w:val="20"/>
+                <w:szCs w:val="20"/>
               </w:rPr>
             </w:pPr>
           </w:p>
@@ -2774,9 +2774,11 @@
           <w:p>
             <w:pPr>
               <w:snapToGrid w:val="0"/>
-              <w:spacing w:line="360" w:lineRule="auto"/>
+              <w:spacing w:line="240" w:lineRule="auto"/>
               <w:rPr>
                 <w:b/>
+                <w:sz w:val="20"/>
+                <w:szCs w:val="20"/>
               </w:rPr>
             </w:pPr>
           </w:p>
@@ -2794,9 +2796,11 @@
           <w:p>
             <w:pPr>
               <w:snapToGrid w:val="0"/>
-              <w:spacing w:line="360" w:lineRule="auto"/>
+              <w:spacing w:line="240" w:lineRule="auto"/>
               <w:rPr>
                 <w:b/>
+                <w:sz w:val="20"/>
+                <w:szCs w:val="20"/>
               </w:rPr>
             </w:pPr>
           </w:p>
@@ -2815,9 +2819,11 @@
           <w:p>
             <w:pPr>
               <w:snapToGrid w:val="0"/>
-              <w:spacing w:line="360" w:lineRule="auto"/>
+              <w:spacing w:line="240" w:lineRule="auto"/>
               <w:rPr>
                 <w:b/>
+                <w:sz w:val="20"/>
+                <w:szCs w:val="20"/>
               </w:rPr>
             </w:pPr>
           </w:p>
@@ -2840,7 +2846,7 @@
           <w:p>
             <w:pPr>
               <w:snapToGrid w:val="0"/>
-              <w:spacing w:line="360" w:lineRule="auto"/>
+              <w:spacing w:line="240" w:lineRule="auto"/>
               <w:jc w:val="center"/>
               <w:rPr>
                 <w:sz w:val="22"/>
@@ -2852,7 +2858,7 @@
                 <w:sz w:val="22"/>
                 <w:szCs w:val="22"/>
               </w:rPr>
-              <w:t xml:space="preserve">POSTGRADO </w:t>
+              <w:t xml:space="preserve">POSTGRADO</w:t>
             </w:r>
           </w:p>
         </w:tc>
@@ -2869,12 +2875,18 @@
           <w:p>
             <w:pPr>
               <w:snapToGrid w:val="0"/>
-              <w:spacing w:line="360" w:lineRule="auto"/>
+              <w:spacing w:line="240" w:lineRule="auto"/>
               <w:rPr>
                 <w:b/>
+                <w:sz w:val="20"/>
+                <w:szCs w:val="20"/>
               </w:rPr>
             </w:pPr>
             <w:r>
+              <w:rPr>
+                <w:sz w:val="20"/>
+                <w:szCs w:val="20"/>
+              </w:rPr>
               <w:t>${grado_postgrado_institucion}</w:t>
             </w:r>
           </w:p>
@@ -2892,15 +2904,18 @@
           <w:p>
             <w:pPr>
               <w:snapToGrid w:val="0"/>
-              <w:spacing w:line="360" w:lineRule="auto"/>
+              <w:spacing w:line="240" w:lineRule="auto"/>
               <w:rPr>
                 <w:b/>
+                <w:sz w:val="20"/>
+                <w:szCs w:val="20"/>
               </w:rPr>
             </w:pPr>
             <w:r>
-              <w:t xml:space="preserve"> </w:t>
-            </w:r>
-            <w:r>
+              <w:rPr>
+                <w:sz w:val="20"/>
+                <w:szCs w:val="20"/>
+              </w:rPr>
               <w:t>${grado_postgrado_titulo}</w:t>
             </w:r>
           </w:p>
@@ -2918,15 +2933,18 @@
           <w:p>
             <w:pPr>
               <w:snapToGrid w:val="0"/>
-              <w:spacing w:line="360" w:lineRule="auto"/>
+              <w:spacing w:line="240" w:lineRule="auto"/>
               <w:rPr>
                 <w:b/>
+                <w:sz w:val="20"/>
+                <w:szCs w:val="20"/>
               </w:rPr>
             </w:pPr>
             <w:r>
-              <w:t xml:space="preserve"> </w:t>
-            </w:r>
-            <w:r>
+              <w:rPr>
+                <w:sz w:val="20"/>
+                <w:szCs w:val="20"/>
+              </w:rPr>
               <w:t>${grado_postgrado_anos}</w:t>
             </w:r>
           </w:p>
@@ -2944,15 +2962,18 @@
           <w:p>
             <w:pPr>
               <w:snapToGrid w:val="0"/>
-              <w:spacing w:line="360" w:lineRule="auto"/>
+              <w:spacing w:line="240" w:lineRule="auto"/>
               <w:rPr>
                 <w:b/>
+                <w:sz w:val="20"/>
+                <w:szCs w:val="20"/>
               </w:rPr>
             </w:pPr>
             <w:r>
-              <w:t xml:space="preserve"> </w:t>
-            </w:r>
-            <w:r>
+              <w:rPr>
+                <w:sz w:val="20"/>
+                <w:szCs w:val="20"/>
+              </w:rPr>
               <w:t>${grado_postgrado_pais}</w:t>
             </w:r>
           </w:p>
@@ -2971,15 +2992,18 @@
           <w:p>
             <w:pPr>
               <w:snapToGrid w:val="0"/>
-              <w:spacing w:line="360" w:lineRule="auto"/>
+              <w:spacing w:line="240" w:lineRule="auto"/>
               <w:rPr>
                 <w:b/>
+                <w:sz w:val="20"/>
+                <w:szCs w:val="20"/>
               </w:rPr>
             </w:pPr>
             <w:r>
-              <w:t xml:space="preserve"> </w:t>
-            </w:r>
-            <w:r>
+              <w:rPr>
+                <w:sz w:val="20"/>
+                <w:szCs w:val="20"/>
+              </w:rPr>
               <w:t>${grado_postgrado_fecha}</w:t>
             </w:r>
           </w:p>
@@ -3001,7 +3025,7 @@
           <w:p>
             <w:pPr>
               <w:snapToGrid w:val="0"/>
-              <w:spacing w:line="360" w:lineRule="auto"/>
+              <w:spacing w:line="240" w:lineRule="auto"/>
               <w:jc w:val="center"/>
               <w:rPr>
                 <w:sz w:val="22"/>
@@ -3013,7 +3037,7 @@
                 <w:sz w:val="22"/>
                 <w:szCs w:val="22"/>
               </w:rPr>
-              <w:t xml:space="preserve"> OTROS </w:t>
+              <w:t xml:space="preserve">OTROS</w:t>
             </w:r>
           </w:p>
         </w:tc>
@@ -3029,12 +3053,18 @@
           <w:p>
             <w:pPr>
               <w:snapToGrid w:val="0"/>
-              <w:spacing w:line="360" w:lineRule="auto"/>
+              <w:spacing w:line="240" w:lineRule="auto"/>
               <w:rPr>
                 <w:b/>
+                <w:sz w:val="20"/>
+                <w:szCs w:val="20"/>
               </w:rPr>
             </w:pPr>
             <w:r>
+              <w:rPr>
+                <w:sz w:val="20"/>
+                <w:szCs w:val="20"/>
+              </w:rPr>
               <w:t>${grado_otros_institucion}</w:t>
             </w:r>
           </w:p>
@@ -3051,15 +3081,18 @@
           <w:p>
             <w:pPr>
               <w:snapToGrid w:val="0"/>
-              <w:spacing w:line="360" w:lineRule="auto"/>
+              <w:spacing w:line="240" w:lineRule="auto"/>
               <w:rPr>
                 <w:b/>
+                <w:sz w:val="20"/>
+                <w:szCs w:val="20"/>
               </w:rPr>
             </w:pPr>
             <w:r>
-              <w:t xml:space="preserve"> </w:t>
-            </w:r>
-            <w:r>
+              <w:rPr>
+                <w:sz w:val="20"/>
+                <w:szCs w:val="20"/>
+              </w:rPr>
               <w:t>${grado_otros_titulo}</w:t>
             </w:r>
           </w:p>
@@ -3076,15 +3109,18 @@
           <w:p>
             <w:pPr>
               <w:snapToGrid w:val="0"/>
-              <w:spacing w:line="360" w:lineRule="auto"/>
+              <w:spacing w:line="240" w:lineRule="auto"/>
               <w:rPr>
                 <w:b/>
+                <w:sz w:val="20"/>
+                <w:szCs w:val="20"/>
               </w:rPr>
             </w:pPr>
             <w:r>
-              <w:t xml:space="preserve"> </w:t>
-            </w:r>
-            <w:r>
+              <w:rPr>
+                <w:sz w:val="20"/>
+                <w:szCs w:val="20"/>
+              </w:rPr>
               <w:t>${grado_otros_anos}</w:t>
             </w:r>
           </w:p>
@@ -3101,15 +3137,18 @@
           <w:p>
             <w:pPr>
               <w:snapToGrid w:val="0"/>
-              <w:spacing w:line="360" w:lineRule="auto"/>
+              <w:spacing w:line="240" w:lineRule="auto"/>
               <w:rPr>
                 <w:b/>
+                <w:sz w:val="20"/>
+                <w:szCs w:val="20"/>
               </w:rPr>
             </w:pPr>
             <w:r>
-              <w:t xml:space="preserve"> </w:t>
-            </w:r>
-            <w:r>
+              <w:rPr>
+                <w:sz w:val="20"/>
+                <w:szCs w:val="20"/>
+              </w:rPr>
               <w:t>${grado_otros_pais}</w:t>
             </w:r>
           </w:p>
@@ -3127,15 +3166,18 @@
           <w:p>
             <w:pPr>
               <w:snapToGrid w:val="0"/>
-              <w:spacing w:line="360" w:lineRule="auto"/>
+              <w:spacing w:line="240" w:lineRule="auto"/>
               <w:rPr>
                 <w:b/>
+                <w:sz w:val="20"/>
+                <w:szCs w:val="20"/>
               </w:rPr>
             </w:pPr>
             <w:r>
-              <w:t xml:space="preserve"> </w:t>
-            </w:r>
-            <w:r>
+              <w:rPr>
+                <w:sz w:val="20"/>
+                <w:szCs w:val="20"/>
+              </w:rPr>
               <w:t>${grado_otros_fecha}</w:t>
             </w:r>
           </w:p>
@@ -4297,6 +4339,9 @@
                       <w:ilvl w:val="0"/>
                       <w:numId w:val="1"/>
                     </w:numPr>
+                    <w:tabs>
+                      <w:tab w:val="right" w:pos="10160"/>
+                    </w:tabs>
                     <w:rPr>
                       <w:sz w:val="24"/>
                       <w:szCs w:val="24"/>
@@ -4321,43 +4366,8 @@
                       <w:sz w:val="24"/>
                       <w:szCs w:val="24"/>
                     </w:rPr>
-                    <w:t xml:space="preserve"> </w:t>
-                  </w:r>
-                  <w:r>
-                    <w:rPr>
-                      <w:sz w:val="24"/>
-                      <w:szCs w:val="24"/>
-                    </w:rPr>
                     <w:tab/>
-                  </w:r>
-                  <w:r>
-                    <w:rPr>
-                      <w:sz w:val="24"/>
-                      <w:szCs w:val="24"/>
-                    </w:rPr>
-                    <w:tab/>
-                  </w:r>
-                  <w:r>
-                    <w:rPr>
-                      <w:sz w:val="24"/>
-                      <w:szCs w:val="24"/>
-                    </w:rPr>
-                    <w:tab/>
-                  </w:r>
-                  <w:r>
-                    <w:rPr>
-                      <w:sz w:val="24"/>
-                      <w:szCs w:val="24"/>
-                    </w:rPr>
-                    <w:tab/>
-                  </w:r>
-                  <w:r>
-                    <w:rPr>
-                      <w:sz w:val="24"/>
-                      <w:szCs w:val="24"/>
-                    </w:rPr>
-                    <w:tab/>
-                    <w:t xml:space="preserve">                         SI${doc1_si} NO${doc1_no}</w:t>
+                    <w:t xml:space="preserve">SI_${doc1_si}_NO_${doc1_no}_</w:t>
                   </w:r>
                 </w:p>
                 <w:p>
@@ -4367,6 +4377,9 @@
                       <w:ilvl w:val="0"/>
                       <w:numId w:val="1"/>
                     </w:numPr>
+                    <w:tabs>
+                      <w:tab w:val="right" w:pos="10160"/>
+                    </w:tabs>
                     <w:rPr>
                       <w:sz w:val="24"/>
                       <w:szCs w:val="24"/>
@@ -4385,49 +4398,7 @@
                       <w:szCs w:val="24"/>
                     </w:rPr>
                     <w:tab/>
-                  </w:r>
-                  <w:r>
-                    <w:rPr>
-                      <w:sz w:val="24"/>
-                      <w:szCs w:val="24"/>
-                    </w:rPr>
-                    <w:tab/>
-                  </w:r>
-                  <w:r>
-                    <w:rPr>
-                      <w:sz w:val="24"/>
-                      <w:szCs w:val="24"/>
-                    </w:rPr>
-                    <w:tab/>
-                  </w:r>
-                  <w:r>
-                    <w:rPr>
-                      <w:sz w:val="24"/>
-                      <w:szCs w:val="24"/>
-                    </w:rPr>
-                    <w:tab/>
-                  </w:r>
-                  <w:r>
-                    <w:rPr>
-                      <w:sz w:val="24"/>
-                      <w:szCs w:val="24"/>
-                    </w:rPr>
-                    <w:tab/>
-                  </w:r>
-                  <w:r>
-                    <w:rPr>
-                      <w:sz w:val="24"/>
-                      <w:szCs w:val="24"/>
-                    </w:rPr>
-                    <w:tab/>
-                  </w:r>
-                  <w:r>
-                    <w:rPr>
-                      <w:sz w:val="24"/>
-                      <w:szCs w:val="24"/>
-                    </w:rPr>
-                    <w:tab/>
-                    <w:t xml:space="preserve">            SI${doc2_si} NO${doc2_no}</w:t>
+                    <w:t xml:space="preserve">SI_${doc2_si}_NO_${doc2_no}_</w:t>
                   </w:r>
                 </w:p>
                 <w:p>
@@ -4437,6 +4408,9 @@
                       <w:ilvl w:val="0"/>
                       <w:numId w:val="1"/>
                     </w:numPr>
+                    <w:tabs>
+                      <w:tab w:val="right" w:pos="10160"/>
+                    </w:tabs>
                     <w:rPr>
                       <w:sz w:val="24"/>
                       <w:szCs w:val="24"/>
@@ -4455,14 +4429,7 @@
                       <w:szCs w:val="24"/>
                     </w:rPr>
                     <w:tab/>
-                  </w:r>
-                  <w:r>
-                    <w:rPr>
-                      <w:sz w:val="24"/>
-                      <w:szCs w:val="24"/>
-                    </w:rPr>
-                    <w:tab/>
-                    <w:t xml:space="preserve">            SI${doc3_si} NO${doc3_no}</w:t>
+                    <w:t xml:space="preserve">SI_${doc3_si}_NO_${doc3_no}_</w:t>
                   </w:r>
                 </w:p>
                 <w:p>
@@ -4472,6 +4439,9 @@
                       <w:ilvl w:val="0"/>
                       <w:numId w:val="1"/>
                     </w:numPr>
+                    <w:tabs>
+                      <w:tab w:val="right" w:pos="10160"/>
+                    </w:tabs>
                     <w:rPr>
                       <w:sz w:val="24"/>
                       <w:szCs w:val="24"/>
@@ -4490,35 +4460,7 @@
                       <w:szCs w:val="24"/>
                     </w:rPr>
                     <w:tab/>
-                  </w:r>
-                  <w:r>
-                    <w:rPr>
-                      <w:sz w:val="24"/>
-                      <w:szCs w:val="24"/>
-                    </w:rPr>
-                    <w:tab/>
-                  </w:r>
-                  <w:r>
-                    <w:rPr>
-                      <w:sz w:val="24"/>
-                      <w:szCs w:val="24"/>
-                    </w:rPr>
-                    <w:tab/>
-                  </w:r>
-                  <w:r>
-                    <w:rPr>
-                      <w:sz w:val="24"/>
-                      <w:szCs w:val="24"/>
-                    </w:rPr>
-                    <w:tab/>
-                  </w:r>
-                  <w:r>
-                    <w:rPr>
-                      <w:sz w:val="24"/>
-                      <w:szCs w:val="24"/>
-                    </w:rPr>
-                    <w:tab/>
-                    <w:t xml:space="preserve">            SI${doc4_si} NO${doc4_no}</w:t>
+                    <w:t xml:space="preserve">SI_${doc4_si}_NO_${doc4_no}_</w:t>
                   </w:r>
                 </w:p>
                 <w:p>
@@ -4528,6 +4470,9 @@
                       <w:ilvl w:val="0"/>
                       <w:numId w:val="1"/>
                     </w:numPr>
+                    <w:tabs>
+                      <w:tab w:val="right" w:pos="10160"/>
+                    </w:tabs>
                     <w:rPr>
                       <w:sz w:val="24"/>
                       <w:szCs w:val="24"/>
@@ -4546,42 +4491,7 @@
                       <w:szCs w:val="24"/>
                     </w:rPr>
                     <w:tab/>
-                  </w:r>
-                  <w:r>
-                    <w:rPr>
-                      <w:sz w:val="24"/>
-                      <w:szCs w:val="24"/>
-                    </w:rPr>
-                    <w:tab/>
-                  </w:r>
-                  <w:r>
-                    <w:rPr>
-                      <w:sz w:val="24"/>
-                      <w:szCs w:val="24"/>
-                    </w:rPr>
-                    <w:tab/>
-                  </w:r>
-                  <w:r>
-                    <w:rPr>
-                      <w:sz w:val="24"/>
-                      <w:szCs w:val="24"/>
-                    </w:rPr>
-                    <w:tab/>
-                  </w:r>
-                  <w:r>
-                    <w:rPr>
-                      <w:sz w:val="24"/>
-                      <w:szCs w:val="24"/>
-                    </w:rPr>
-                    <w:tab/>
-                  </w:r>
-                  <w:r>
-                    <w:rPr>
-                      <w:sz w:val="24"/>
-                      <w:szCs w:val="24"/>
-                    </w:rPr>
-                    <w:tab/>
-                    <w:t xml:space="preserve">            SI${doc5_si} NO${doc5_no}</w:t>
+                    <w:t xml:space="preserve">SI_${doc5_si}_NO_${doc5_no}_</w:t>
                   </w:r>
                 </w:p>
                 <w:p>
@@ -4591,6 +4501,9 @@
                       <w:ilvl w:val="0"/>
                       <w:numId w:val="1"/>
                     </w:numPr>
+                    <w:tabs>
+                      <w:tab w:val="right" w:pos="10160"/>
+                    </w:tabs>
                     <w:rPr>
                       <w:sz w:val="24"/>
                       <w:szCs w:val="24"/>
@@ -4609,42 +4522,7 @@
                       <w:szCs w:val="24"/>
                     </w:rPr>
                     <w:tab/>
-                  </w:r>
-                  <w:r>
-                    <w:rPr>
-                      <w:sz w:val="24"/>
-                      <w:szCs w:val="24"/>
-                    </w:rPr>
-                    <w:tab/>
-                  </w:r>
-                  <w:r>
-                    <w:rPr>
-                      <w:sz w:val="24"/>
-                      <w:szCs w:val="24"/>
-                    </w:rPr>
-                    <w:tab/>
-                  </w:r>
-                  <w:r>
-                    <w:rPr>
-                      <w:sz w:val="24"/>
-                      <w:szCs w:val="24"/>
-                    </w:rPr>
-                    <w:tab/>
-                  </w:r>
-                  <w:r>
-                    <w:rPr>
-                      <w:sz w:val="24"/>
-                      <w:szCs w:val="24"/>
-                    </w:rPr>
-                    <w:tab/>
-                  </w:r>
-                  <w:r>
-                    <w:rPr>
-                      <w:sz w:val="24"/>
-                      <w:szCs w:val="24"/>
-                    </w:rPr>
-                    <w:tab/>
-                    <w:t xml:space="preserve">            SI${doc6_si} NO${doc6_no}</w:t>
+                    <w:t xml:space="preserve">SI_${doc6_si}_NO_${doc6_no}_</w:t>
                   </w:r>
                 </w:p>
                 <w:p>
@@ -4670,6 +4548,9 @@
                 <w:p>
                   <w:pPr>
                     <w:pStyle w:val="Prrafodelista"/>
+                    <w:tabs>
+                      <w:tab w:val="right" w:pos="10160"/>
+                    </w:tabs>
                     <w:ind w:left="709"/>
                     <w:rPr>
                       <w:sz w:val="24"/>
@@ -4681,85 +4562,15 @@
                       <w:sz w:val="24"/>
                       <w:szCs w:val="24"/>
                     </w:rPr>
-                    <w:t xml:space="preserve"> </w:t>
+                    <w:t>alguna constancia)</w:t>
                   </w:r>
                   <w:r>
                     <w:rPr>
                       <w:sz w:val="24"/>
                       <w:szCs w:val="24"/>
                     </w:rPr>
-                    <w:t>alguna constancia)</w:t>
-                  </w:r>
-                  <w:r>
-                    <w:rPr>
-                      <w:sz w:val="24"/>
-                      <w:szCs w:val="24"/>
-                    </w:rPr>
-                    <w:t xml:space="preserve"> </w:t>
-                  </w:r>
-                  <w:r>
-                    <w:rPr>
-                      <w:sz w:val="24"/>
-                      <w:szCs w:val="24"/>
-                    </w:rPr>
                     <w:tab/>
-                  </w:r>
-                  <w:r>
-                    <w:rPr>
-                      <w:sz w:val="24"/>
-                      <w:szCs w:val="24"/>
-                    </w:rPr>
-                    <w:tab/>
-                  </w:r>
-                  <w:r>
-                    <w:rPr>
-                      <w:sz w:val="24"/>
-                      <w:szCs w:val="24"/>
-                    </w:rPr>
-                    <w:tab/>
-                  </w:r>
-                  <w:r>
-                    <w:rPr>
-                      <w:sz w:val="24"/>
-                      <w:szCs w:val="24"/>
-                    </w:rPr>
-                    <w:tab/>
-                  </w:r>
-                  <w:r>
-                    <w:rPr>
-                      <w:sz w:val="24"/>
-                      <w:szCs w:val="24"/>
-                    </w:rPr>
-                    <w:tab/>
-                  </w:r>
-                  <w:r>
-                    <w:rPr>
-                      <w:sz w:val="24"/>
-                      <w:szCs w:val="24"/>
-                    </w:rPr>
-                    <w:tab/>
-                  </w:r>
-                  <w:r>
-                    <w:rPr>
-                      <w:sz w:val="24"/>
-                      <w:szCs w:val="24"/>
-                    </w:rPr>
-                    <w:tab/>
-                  </w:r>
-                  <w:r>
-                    <w:rPr>
-                      <w:sz w:val="24"/>
-                      <w:szCs w:val="24"/>
-                    </w:rPr>
-                    <w:tab/>
-                  </w:r>
-                  <w:r>
-                    <w:rPr>
-                      <w:sz w:val="24"/>
-                      <w:szCs w:val="24"/>
-                    </w:rPr>
-                    <w:tab/>
-                    <w:t xml:space="preserve">            SI${doc7_si} NO${doc7_no}</w:t>
+                    <w:t xml:space="preserve">SI_${doc7_si}_NO_${doc7_no}_</w:t>
                   </w:r>
                 </w:p>
                 <w:p>
@@ -4981,6 +4792,23 @@
     </w:p>
     <w:p>
       <w:pPr>
+        <w:spacing w:before="60" w:after="60" w:line="240" w:lineRule="auto"/>
+        <w:jc w:val="both"/>
+        <w:rPr>
+          <w:sz w:val="20"/>
+          <w:szCs w:val="20"/>
+        </w:rPr>
+      </w:pPr>
+      <w:r>
+        <w:rPr>
+          <w:sz w:val="20"/>
+          <w:szCs w:val="20"/>
+        </w:rPr>
+        <w:t>HAGO CONSTAR QUE LOS DATOS AQUÍ ESPECIFICADOS SON VERDADEDROS Y PUEDEN ESTAR SUJETOS A VERIFICACIÓN, CUALQUIER DISCREPANCIA ANULA EL PROCESO DE SELECCIÓN.</w:t>
+      </w:r>
+    </w:p>
+    <w:p>
+      <w:pPr>
         <w:spacing w:before="60" w:after="60" w:line="360" w:lineRule="auto"/>
         <w:jc w:val="both"/>
         <w:rPr>
@@ -4988,27 +4816,10 @@
           <w:szCs w:val="20"/>
         </w:rPr>
       </w:pPr>
-      <w:r>
-        <w:rPr>
-          <w:sz w:val="20"/>
-          <w:szCs w:val="20"/>
-        </w:rPr>
-        <w:t>HAGO CONSTAR QUE LOS DATOS AQUÍ ESPECIFICADOS SON VERDADEDROS Y PUEDEN ESTAR SUJETOS A VERIFICACIÓN, CUALQUIER DISCREPANCIA ANULA EL PROCESO DE SELECCIÓN.</w:t>
-      </w:r>
-    </w:p>
-    <w:p>
-      <w:pPr>
-        <w:spacing w:before="60" w:after="60" w:line="360" w:lineRule="auto"/>
-        <w:jc w:val="both"/>
-        <w:rPr>
-          <w:sz w:val="20"/>
-          <w:szCs w:val="20"/>
-        </w:rPr>
-      </w:pPr>
-    </w:p>
-    <w:p>
-      <w:pPr>
-        <w:spacing w:before="60" w:after="60" w:line="360" w:lineRule="auto"/>
+    </w:p>
+    <w:p>
+      <w:pPr>
+        <w:spacing w:before="60" w:after="60" w:line="240" w:lineRule="auto"/>
         <w:jc w:val="both"/>
         <w:rPr>
           <w:sz w:val="20"/>
@@ -5050,7 +4861,7 @@
     </w:p>
     <w:p>
       <w:pPr>
-        <w:spacing w:before="60" w:after="60" w:line="360" w:lineRule="auto"/>
+        <w:spacing w:before="60" w:after="60" w:line="240" w:lineRule="auto"/>
         <w:jc w:val="both"/>
         <w:rPr>
           <w:sz w:val="20"/>
@@ -5069,14 +4880,14 @@
           <w:sz w:val="20"/>
           <w:szCs w:val="20"/>
         </w:rPr>
-        <w:t>PARTICIPANTE:</w:t>
+        <w:t>PARTICIPANTE: _</w:t>
       </w:r>
       <w:r>
         <w:rPr>
           <w:sz w:val="20"/>
           <w:szCs w:val="20"/>
         </w:rPr>
-        <w:t/>
+        <w:t>___________________________________________</w:t>
       </w:r>
     </w:p>
     <w:p>
@@ -5091,6 +4902,7 @@
     </w:p>
     <w:p>
       <w:pPr>
+        <w:pageBreakBefore/>
         <w:spacing w:before="60" w:after="60" w:line="360" w:lineRule="auto"/>
         <w:jc w:val="both"/>
         <w:rPr>

</xml_diff>